<commit_message>
QS-Stellenbeschreibung: Qualifikationen/Kompetenzen/Mindestanforderungen von Alexander bestaetigt
Roten Pruefhinweis entfernt, da Inhalt freigegeben.

Co-Authored-By: Claude Sonnet 5 <noreply@anthropic.com>
Claude-Session: https://claude.ai/code/session_01KTGUGVaPm39C5Y3H1dpETj
</commit_message>
<xml_diff>
--- a/working/QS_Stellenbeschreibung_Arbeitsentwurf.docx
+++ b/working/QS_Stellenbeschreibung_Arbeitsentwurf.docx
@@ -1174,22 +1174,6 @@
           <w:rFonts w:ascii="Calibri" w:cs="Calibri" w:eastAsia="Calibri" w:hAnsi="Calibri"/>
         </w:rPr>
         <w:t xml:space="preserve">Gute EDV-Anwenderkenntnisse (ERP-/MES-Systeme)</w:t>
-      </w:r>
-    </w:p>
-    <w:p>
-      <w:pPr>
-        <w:spacing w:before="300"/>
-      </w:pPr>
-      <w:r>
-        <w:rPr>
-          <w:rFonts w:ascii="Calibri" w:cs="Calibri" w:eastAsia="Calibri" w:hAnsi="Calibri"/>
-          <w:i/>
-          <w:iCs/>
-          <w:color w:val="CC0000"/>
-          <w:sz w:val="18"/>
-          <w:szCs w:val="18"/>
-        </w:rPr>
-        <w:t xml:space="preserve">Hinweis: Die Abschnitte „Erforderliche Qualifikationen“, „Erforderliche Kompetenzen“ und „Mindestanforderungen“ sind ein erster Vorschlag und noch von Alexander zu prüfen/anzupassen (konkrete Ausbildungs-/Erfahrungsschwellen liegen außerhalb dessen, was sich aus dem bisherigen Dokument ableiten lässt).</w:t>
       </w:r>
     </w:p>
     <w:sectPr>

</xml_diff>

<commit_message>
QS-Stellenbeschreibung: Mindestanforderung "Kenntnis aller Bauteile" ergaenzt
Co-Authored-By: Claude Sonnet 5 <noreply@anthropic.com>
Claude-Session: https://claude.ai/code/session_01KTGUGVaPm39C5Y3H1dpETj
</commit_message>
<xml_diff>
--- a/working/QS_Stellenbeschreibung_Arbeitsentwurf.docx
+++ b/working/QS_Stellenbeschreibung_Arbeitsentwurf.docx
@@ -1174,6 +1174,23 @@
           <w:rFonts w:ascii="Calibri" w:cs="Calibri" w:eastAsia="Calibri" w:hAnsi="Calibri"/>
         </w:rPr>
         <w:t xml:space="preserve">Gute EDV-Anwenderkenntnisse (ERP-/MES-Systeme)</w:t>
+      </w:r>
+    </w:p>
+    <w:p>
+      <w:pPr>
+        <w:pStyle w:val="ListParagraph"/>
+        <w:numPr>
+          <w:ilvl w:val="0"/>
+          <w:numId w:val="2"/>
+        </w:numPr>
+        <w:spacing w:after="80"/>
+        <w:jc w:val="both"/>
+      </w:pPr>
+      <w:r>
+        <w:rPr>
+          <w:rFonts w:ascii="Calibri" w:cs="Calibri" w:eastAsia="Calibri" w:hAnsi="Calibri"/>
+        </w:rPr>
+        <w:t xml:space="preserve">Kenntnis aller Bauteile (Produktportfolio, Qualitätsanforderungen, typische Fehlerbilder)</w:t>
       </w:r>
     </w:p>
     <w:sectPr>

</xml_diff>

<commit_message>
QS: Hinweis ergänzt, dass die Funktion Vollzeitstelle oder Teilbereich sein kann
Anders als Produktionskoordination (immer Teilbereich) ist QS je nach
Standort unterschiedlich: in Pfarrkirchen eigenständige Vollzeitstelle
(Dominik fällt dort ersatzlos weg), in Losenstein Teilbereich (2/3) in
Kombination mit Produktionskoordination (1/3). Hinweis direkt nach dem
Titel in der Stellenbeschreibung sowie in notes/QS.md ergänzt.

Co-Authored-By: Claude Sonnet 5 <noreply@anthropic.com>
Claude-Session: https://claude.ai/code/session_01DYu9Jmx4EF5jDapuJDs8ut
</commit_message>
<xml_diff>
--- a/working/QS_Stellenbeschreibung_Arbeitsentwurf.docx
+++ b/working/QS_Stellenbeschreibung_Arbeitsentwurf.docx
@@ -16,7 +16,7 @@
     </w:p>
     <w:p>
       <w:pPr>
-        <w:spacing w:after="200"/>
+        <w:spacing w:after="160"/>
       </w:pPr>
       <w:r>
         <w:rPr>
@@ -27,6 +27,22 @@
           <w:szCs w:val="18"/>
         </w:rPr>
         <w:t xml:space="preserve">Arbeitsentwurf.</w:t>
+      </w:r>
+    </w:p>
+    <w:p>
+      <w:pPr>
+        <w:spacing w:after="200"/>
+        <w:jc w:val="both"/>
+      </w:pPr>
+      <w:r>
+        <w:rPr>
+          <w:rFonts w:ascii="Calibri" w:cs="Calibri" w:eastAsia="Calibri" w:hAnsi="Calibri"/>
+          <w:b/>
+          <w:bCs/>
+          <w:sz w:val="20"/>
+          <w:szCs w:val="20"/>
+        </w:rPr>
+        <w:t xml:space="preserve">Diese Funktion kann als eigenständige Vollzeitstelle oder als Teilaufgabenbereich in Kombination mit anderen Aufgaben-/Verantwortungsbereichen (z. B. Produktionskoordination) ausgeübt werden.</w:t>
       </w:r>
     </w:p>
     <w:p>

</xml_diff>